<commit_message>
docs: el indicador 5 de la autoevaluación baja a Logrado, con su justificación
El docente comentó en la exposición de la Fase 1 que los objetivos
específicos debían ser los pasos para llegar al general. Mantener ese
indicador en Completamente Logrado contradice la retroalimentación
recibida. Baja a Logrado y la justificación explica el defecto y cómo se
corrigió: seis objetivos encadenados, cada uno con el resultado del
anterior como insumo.

Co-Authored-By: Claude Opus 5 (1M context) <noreply@anthropic.com>
Claude-Session: https://claude.ai/code/session_01Rvh88dkfXqgVzQiFw1YokL
</commit_message>
<xml_diff>
--- a/Fase 1/Evidencias Individuales/Tolentino_Edgar_1.3_APT122_AutoevaluacionFase1.docx
+++ b/Fase 1/Evidencias Individuales/Tolentino_Edgar_1.3_APT122_AutoevaluacionFase1.docx
@@ -7507,6 +7507,42 @@
           <w:tcPr>
             <w:tcW w:w="2268" w:type="dxa"/>
             <w:vAlign w:val="center"/>
+          </w:tcPr>
+          <w:p>
+            <w:pPr>
+              <w:rPr>
+                <w:rFonts w:asciiTheme="minorHAnsi" w:eastAsiaTheme="minorEastAsia" w:hAnsiTheme="minorHAnsi" w:cstheme="minorBidi"/>
+                <w:color w:val="000000" w:themeColor="text1"/>
+                <w:lang w:eastAsia="es-CL"/>
+              </w:rPr>
+            </w:pPr>
+            <w:r>
+              <w:rPr>
+                <w:rFonts w:asciiTheme="minorHAnsi" w:eastAsiaTheme="minorEastAsia" w:hAnsiTheme="minorHAnsi" w:cstheme="minorBidi"/>
+                <w:color w:val="000000" w:themeColor="text1"/>
+              </w:rPr>
+              <w:t>Formul</w:t>
+            </w:r>
+            <w:r>
+              <w:rPr>
+                <w:rFonts w:asciiTheme="minorHAnsi" w:eastAsiaTheme="minorEastAsia" w:hAnsiTheme="minorHAnsi" w:cstheme="minorBidi"/>
+                <w:color w:val="000000" w:themeColor="text1"/>
+              </w:rPr>
+              <w:t>é</w:t>
+            </w:r>
+            <w:r>
+              <w:rPr>
+                <w:rFonts w:asciiTheme="minorHAnsi" w:eastAsiaTheme="minorEastAsia" w:hAnsiTheme="minorHAnsi" w:cstheme="minorBidi"/>
+                <w:color w:val="000000" w:themeColor="text1"/>
+              </w:rPr>
+              <w:t xml:space="preserve"> objetivos claros, concisos y coherentes con la disciplina y la situación a abordar.</w:t>
+            </w:r>
+          </w:p>
+        </w:tc>
+        <w:tc>
+          <w:tcPr>
+            <w:tcW w:w="2126" w:type="dxa"/>
+            <w:vAlign w:val="center"/>
             <w:shd w:val="clear" w:color="auto" w:fill="E7E6E6"/>
           </w:tcPr>
           <w:p>
@@ -7523,43 +7559,7 @@
                 <w:b/>
                 <w:color w:val="000000" w:themeColor="text1"/>
               </w:rPr>
-              <w:t>[X] Formul</w:t>
-            </w:r>
-            <w:r>
-              <w:rPr>
-                <w:rFonts w:asciiTheme="minorHAnsi" w:eastAsiaTheme="minorEastAsia" w:hAnsiTheme="minorHAnsi" w:cstheme="minorBidi"/>
-                <w:color w:val="000000" w:themeColor="text1"/>
-              </w:rPr>
-              <w:t>é</w:t>
-            </w:r>
-            <w:r>
-              <w:rPr>
-                <w:rFonts w:asciiTheme="minorHAnsi" w:eastAsiaTheme="minorEastAsia" w:hAnsiTheme="minorHAnsi" w:cstheme="minorBidi"/>
-                <w:color w:val="000000" w:themeColor="text1"/>
-              </w:rPr>
-              <w:t xml:space="preserve"> objetivos claros, concisos y coherentes con la disciplina y la situación a abordar.</w:t>
-            </w:r>
-          </w:p>
-        </w:tc>
-        <w:tc>
-          <w:tcPr>
-            <w:tcW w:w="2126" w:type="dxa"/>
-            <w:vAlign w:val="center"/>
-          </w:tcPr>
-          <w:p>
-            <w:pPr>
-              <w:rPr>
-                <w:rFonts w:asciiTheme="minorHAnsi" w:eastAsiaTheme="minorEastAsia" w:hAnsiTheme="minorHAnsi" w:cstheme="minorBidi"/>
-                <w:color w:val="000000" w:themeColor="text1"/>
-                <w:lang w:eastAsia="es-CL"/>
-              </w:rPr>
-            </w:pPr>
-            <w:r>
-              <w:rPr>
-                <w:rFonts w:asciiTheme="minorHAnsi" w:eastAsiaTheme="minorEastAsia" w:hAnsiTheme="minorHAnsi" w:cstheme="minorBidi"/>
-                <w:color w:val="000000" w:themeColor="text1"/>
-              </w:rPr>
-              <w:t xml:space="preserve">Formulé </w:t>
+              <w:t xml:space="preserve">[X] Formulé </w:t>
             </w:r>
             <w:r>
               <w:rPr>
@@ -9369,7 +9369,22 @@
           <w:color w:val="1C1C1C"/>
           <w:sz w:val="20"/>
         </w:rPr>
-        <w:t>• Indicadores 1 a 8: la Guía 1.5 describe el proyecto y su relevancia, lo relaciona con las cuatro competencias del perfil de egreso indicando cómo se usa cada una, argumenta la factibilidad con tiempo, materiales y factores externos, y trae objetivos, metodología, plan de trabajo con recursos y obstaculizadores, y evidencias justificadas.</w:t>
+        <w:t>• Indicadores 1 a 4, 6, 7 y 8: la Guía 1.5 describe el proyecto y su relevancia, lo relaciona con las cuatro competencias del perfil de egreso indicando cómo se usa cada una, argumenta la factibilidad con tiempo, materiales y factores externos, y trae metodología, plan de trabajo con recursos y obstaculizadores, y evidencias justificadas.</w:t>
+      </w:r>
+    </w:p>
+    <w:p>
+      <w:pPr>
+        <w:spacing w:after="80"/>
+        <w:ind w:left="283" w:hanging="227"/>
+        <w:jc w:val="both"/>
+      </w:pPr>
+      <w:r>
+        <w:rPr>
+          <w:rFonts w:ascii="Calibri" w:hAnsi="Calibri" w:eastAsia="Calibri"/>
+          <w:color w:val="1C1C1C"/>
+          <w:sz w:val="20"/>
+        </w:rPr>
+        <w:t>• Indicador 5 (Logrado): los objetivos específicos estaban redactados como una lista de entregables y no como las etapas sucesivas para alcanzar el objetivo general. La retroalimentación recibida en la exposición de la Fase 1 fue exactamente esa y se incorporó: quedaron seis objetivos, cada uno con un verbo de acción y tomando como insumo el resultado del anterior.</w:t>
       </w:r>
     </w:p>
     <w:p>

</xml_diff>